<commit_message>
Update architecture + sliding window.docx
</commit_message>
<xml_diff>
--- a/report/architecture + sliding window.docx
+++ b/report/architecture + sliding window.docx
@@ -355,7 +355,7 @@
           <w:sz w:val="26"/>
           <w:szCs w:val="26"/>
         </w:rPr>
-        <w:t>Đây là bộ dữ liệu mở rộng từ MNIST kinh điển, được thiết kế để phục vụ các bài toán nhận dạng chữ số và chữ viết tay đa lớp. Một trong những ưu điểm của EMNIST là tính phổ biến và khả năng phản ánh tốt hơn môi trường thực tế so với MNIST truyền thống, vốn chỉ bao gồm 10 lớp chữ số từ 0 đến 9. EMNIST có nhiều tập con khác nhau, trong đó một số tập bao gồm cả chữ số và chữ cái, làm cho không gian phân loại trở nên phức tạp hơn và sát với các ứng dụng thực tế hơn.</w:t>
+        <w:t>Đây là bộ dữ liệu mở rộng từ MNIST, được thiết kế để phục vụ các bài toán nhận dạng chữ số và chữ viết tay đa lớp. Một trong những ưu điểm của EMNIST là tính phổ biến và khả năng phản ánh tốt hơn môi trường thực tế so với MNIST truyền thống, vốn chỉ bao gồm 10 lớp chữ số từ 0 đến 9. EMNIST có nhiều tập con khác nhau, trong đó một số tập bao gồm cả chữ số và chữ cái, làm cho không gian phân loại trở nên phức tạp hơn và sát với các ứng dụng thực tế hơn.</w:t>
       </w:r>
     </w:p>
     <w:p>
@@ -443,15 +443,58 @@
           <w:szCs w:val="26"/>
         </w:rPr>
       </w:pPr>
+    </w:p>
+    <w:p>
+      <w:pPr>
+        <w:ind w:firstLine="720"/>
+        <w:jc w:val="both"/>
+        <w:rPr>
+          <w:rFonts w:ascii="Arial" w:hAnsi="Arial" w:cs="Arial"/>
+          <w:sz w:val="26"/>
+          <w:szCs w:val="26"/>
+        </w:rPr>
+      </w:pPr>
+    </w:p>
+    <w:p>
+      <w:pPr>
+        <w:ind w:firstLine="720"/>
+        <w:jc w:val="both"/>
+        <w:rPr>
+          <w:rFonts w:ascii="Arial" w:hAnsi="Arial" w:cs="Arial"/>
+          <w:sz w:val="26"/>
+          <w:szCs w:val="26"/>
+        </w:rPr>
+      </w:pPr>
+    </w:p>
+    <w:p>
+      <w:pPr>
+        <w:ind w:firstLine="720"/>
+        <w:jc w:val="both"/>
+        <w:rPr>
+          <w:rFonts w:ascii="Arial" w:hAnsi="Arial" w:cs="Arial"/>
+          <w:sz w:val="26"/>
+          <w:szCs w:val="26"/>
+        </w:rPr>
+      </w:pPr>
+    </w:p>
+    <w:p>
+      <w:pPr>
+        <w:ind w:firstLine="720"/>
+        <w:jc w:val="center"/>
+        <w:rPr>
+          <w:rFonts w:ascii="Arial" w:hAnsi="Arial" w:cs="Arial"/>
+          <w:sz w:val="26"/>
+          <w:szCs w:val="26"/>
+        </w:rPr>
+      </w:pPr>
       <w:r>
         <w:rPr>
           <w:noProof/>
         </w:rPr>
-        <w:lastRenderedPageBreak/>
         <w:drawing>
-          <wp:inline distT="0" distB="0" distL="0" distR="0" wp14:anchorId="636C91D7" wp14:editId="5723D845">
-            <wp:extent cx="5562600" cy="1920240"/>
-            <wp:effectExtent l="0" t="0" r="0" b="3810"/>
+          <wp:inline distT="0" distB="0" distL="0" distR="0" wp14:anchorId="636C91D7" wp14:editId="7DA5A348">
+            <wp:extent cx="5054138" cy="1744716"/>
+            <wp:effectExtent l="0" t="0" r="0" b="8255"/>
             <wp:docPr id="255568370" name="Picture 5" descr="Samples of all letters and digits in the EMNIST dataset."/>
             <wp:cNvGraphicFramePr>
               <a:graphicFrameLocks xmlns:a="http://schemas.openxmlformats.org/drawingml/2006/main" noChangeAspect="1"/>
@@ -481,7 +524,7 @@
                   <pic:spPr bwMode="auto">
                     <a:xfrm>
                       <a:off x="0" y="0"/>
-                      <a:ext cx="5562600" cy="1920240"/>
+                      <a:ext cx="5095531" cy="1759005"/>
                     </a:xfrm>
                     <a:prstGeom prst="rect">
                       <a:avLst/>
@@ -505,6 +548,7 @@
     </w:p>
     <w:p>
       <w:pPr>
+        <w:ind w:firstLine="720"/>
         <w:jc w:val="both"/>
         <w:rPr>
           <w:rFonts w:ascii="Arial" w:hAnsi="Arial" w:cs="Arial"/>
@@ -523,6 +567,7 @@
     </w:p>
     <w:p>
       <w:pPr>
+        <w:ind w:firstLine="720"/>
         <w:jc w:val="both"/>
         <w:rPr>
           <w:rFonts w:ascii="Arial" w:hAnsi="Arial" w:cs="Arial"/>
@@ -536,11 +581,30 @@
           <w:sz w:val="26"/>
           <w:szCs w:val="26"/>
         </w:rPr>
-        <w:t>Trong kiến trúc FPGA, dữ liệu đầu vào thường được biểu diễn theo dạng bit-vector hoặc word-vector có độ rộng cố định. Khi triển khai mô phỏng hoặc khởi tạo bộ nhớ, dữ liệu có thể được lưu dưới dạng tệp .mem, .hex hoặc các định dạng tương đương để nạp vào khối RAM hoặc ROM mô phỏng. Nếu hệ thống sử dụng BRAM hoặc bộ nhớ ngoài để lưu ảnh đầu vào, việc tổ chức dữ liệu phải đảm bảo đúng thứ tự truy cập và đúng định dạng bit để tránh sai lệch khi đọc vào khối tăng tốc.</w:t>
-      </w:r>
-    </w:p>
-    <w:p>
-      <w:pPr>
+        <w:t xml:space="preserve">Trong kiến trúc FPGA, dữ liệu đầu vào thường được biểu diễn theo dạng bit-vector hoặc word-vector có độ rộng cố định. Khi triển khai mô phỏng hoặc khởi tạo bộ nhớ, dữ liệu có thể được lưu dưới dạng </w:t>
+      </w:r>
+      <w:proofErr w:type="gramStart"/>
+      <w:r>
+        <w:rPr>
+          <w:rFonts w:ascii="Arial" w:hAnsi="Arial" w:cs="Arial"/>
+          <w:sz w:val="26"/>
+          <w:szCs w:val="26"/>
+        </w:rPr>
+        <w:t>tệp .mem, .hex</w:t>
+      </w:r>
+      <w:proofErr w:type="gramEnd"/>
+      <w:r>
+        <w:rPr>
+          <w:rFonts w:ascii="Arial" w:hAnsi="Arial" w:cs="Arial"/>
+          <w:sz w:val="26"/>
+          <w:szCs w:val="26"/>
+        </w:rPr>
+        <w:t> hoặc các định dạng tương đương để nạp vào khối RAM hoặc ROM mô phỏng. Nếu hệ thống sử dụng BRAM hoặc bộ nhớ ngoài để lưu ảnh đầu vào, việc tổ chức dữ liệu phải đảm bảo đúng thứ tự truy cập và đúng định dạng bit để tránh sai lệch khi đọc vào khối tăng tốc.</w:t>
+      </w:r>
+    </w:p>
+    <w:p>
+      <w:pPr>
+        <w:ind w:firstLine="720"/>
         <w:jc w:val="both"/>
         <w:rPr>
           <w:rFonts w:ascii="Arial" w:hAnsi="Arial" w:cs="Arial"/>
@@ -577,6 +641,7 @@
     </w:p>
     <w:p>
       <w:pPr>
+        <w:ind w:firstLine="720"/>
         <w:jc w:val="both"/>
         <w:rPr>
           <w:rFonts w:ascii="Arial" w:hAnsi="Arial" w:cs="Arial"/>
@@ -595,6 +660,7 @@
     </w:p>
     <w:p>
       <w:pPr>
+        <w:ind w:firstLine="720"/>
         <w:jc w:val="both"/>
         <w:rPr>
           <w:rFonts w:ascii="Arial" w:hAnsi="Arial" w:cs="Arial"/>
@@ -608,20 +674,13 @@
           <w:sz w:val="26"/>
           <w:szCs w:val="26"/>
         </w:rPr>
-        <w:t xml:space="preserve">Phạm vi của đề tài tập trung vào giai đoạn inference của mô hình CNN, tức là chỉ xét quá trình suy luận từ ảnh đầu vào đến nhãn dự đoán, không đi sâu vào quá </w:t>
-      </w:r>
-      <w:r>
-        <w:rPr>
-          <w:rFonts w:ascii="Arial" w:hAnsi="Arial" w:cs="Arial"/>
-          <w:sz w:val="26"/>
-          <w:szCs w:val="26"/>
-        </w:rPr>
         <w:lastRenderedPageBreak/>
-        <w:t>trình huấn luyện trên phần cứng. Hệ thống cũng tập trung vào một mô hình CNN cụ thể phục vụ nhận dạng ký tự viết tay trên EMNIST, từ đó triển khai thành kiến trúc phần cứng tương ứng trên FPGA.</w:t>
-      </w:r>
-    </w:p>
-    <w:p>
-      <w:pPr>
+        <w:t>Phạm vi của đề tài tập trung vào giai đoạn inference của mô hình CNN, tức là chỉ xét quá trình suy luận từ ảnh đầu vào đến nhãn dự đoán, không đi sâu vào quá trình huấn luyện trên phần cứng. Hệ thống cũng tập trung vào một mô hình CNN cụ thể phục vụ nhận dạng ký tự viết tay trên EMNIST, từ đó triển khai thành kiến trúc phần cứng tương ứng trên FPGA.</w:t>
+      </w:r>
+    </w:p>
+    <w:p>
+      <w:pPr>
+        <w:ind w:firstLine="720"/>
         <w:jc w:val="both"/>
         <w:rPr>
           <w:rFonts w:ascii="Arial" w:hAnsi="Arial" w:cs="Arial"/>
@@ -1731,6 +1790,7 @@
     </w:p>
     <w:p>
       <w:pPr>
+        <w:ind w:firstLine="720"/>
         <w:jc w:val="both"/>
         <w:rPr>
           <w:rFonts w:ascii="Arial" w:hAnsi="Arial" w:cs="Arial"/>
@@ -1767,6 +1827,7 @@
     </w:p>
     <w:p>
       <w:pPr>
+        <w:ind w:firstLine="720"/>
         <w:jc w:val="both"/>
         <w:rPr>
           <w:rFonts w:ascii="Arial" w:hAnsi="Arial" w:cs="Arial"/>
@@ -1848,6 +1909,7 @@
     </w:p>
     <w:p>
       <w:pPr>
+        <w:ind w:firstLine="720"/>
         <w:jc w:val="both"/>
         <w:rPr>
           <w:rFonts w:ascii="Arial" w:hAnsi="Arial" w:cs="Arial"/>
@@ -1879,7 +1941,7 @@
           <w:sz w:val="26"/>
           <w:szCs w:val="26"/>
         </w:rPr>
-        <w:t>[Gợi ý hình nếu cần] Có thể bổ sung một sơ đồ nhỏ minh họa logits và argmax ở cuối phần này, nhưng không bắt buộc. Nếu hệ thống của bạn xuất trực tiếp Predicted Class ID thì nên nêu rõ rằng softmax không được hiện thực để tối ưu phần cứng.</w:t>
+        <w:t>1.3. Mô hình CNN tham chiếu của đề tài và phân tích độ phức tạp</w:t>
       </w:r>
     </w:p>
     <w:p>
@@ -1897,29 +1959,12 @@
           <w:sz w:val="26"/>
           <w:szCs w:val="26"/>
         </w:rPr>
-        <w:t>1.3. Mô hình CNN tham chiếu của đề tài và phân tích độ phức tạp</w:t>
-      </w:r>
-    </w:p>
-    <w:p>
-      <w:pPr>
-        <w:jc w:val="both"/>
-        <w:rPr>
-          <w:rFonts w:ascii="Arial" w:hAnsi="Arial" w:cs="Arial"/>
-          <w:sz w:val="26"/>
-          <w:szCs w:val="26"/>
-        </w:rPr>
-      </w:pPr>
-      <w:r>
-        <w:rPr>
-          <w:rFonts w:ascii="Arial" w:hAnsi="Arial" w:cs="Arial"/>
-          <w:sz w:val="26"/>
-          <w:szCs w:val="26"/>
-        </w:rPr>
         <w:t>1.3.1. Cấu hình chi tiết mô hình CNN</w:t>
       </w:r>
     </w:p>
     <w:p>
       <w:pPr>
+        <w:ind w:firstLine="720"/>
         <w:jc w:val="both"/>
         <w:rPr>
           <w:rFonts w:ascii="Arial" w:hAnsi="Arial" w:cs="Arial"/>
@@ -2009,6 +2054,7 @@
     </w:p>
     <w:p>
       <w:pPr>
+        <w:ind w:firstLine="720"/>
         <w:jc w:val="both"/>
         <w:rPr>
           <w:rFonts w:ascii="Arial" w:hAnsi="Arial" w:cs="Arial"/>
@@ -2027,6 +2073,7 @@
     </w:p>
     <w:p>
       <w:pPr>
+        <w:ind w:firstLine="720"/>
         <w:jc w:val="both"/>
         <w:rPr>
           <w:rFonts w:ascii="Arial" w:hAnsi="Arial" w:cs="Arial"/>
@@ -2040,8 +2087,28 @@
           <w:sz w:val="26"/>
           <w:szCs w:val="26"/>
         </w:rPr>
-        <w:t xml:space="preserve">Đây là mô hình đủ đơn giản để có thể triển khai trên FPGA với tài nguyên giới hạn, nhưng đồng thời vẫn đủ mạnh để học được đặc trưng cần thiết của dữ liệu </w:t>
-      </w:r>
+        <w:t>Đây là mô hình đủ đơn giản để có thể triển khai trên FPGA với tài nguyên giới hạn, nhưng đồng thời vẫn đủ mạnh để học được đặc trưng cần thiết của dữ liệu EMNIST. Đặc biệt, cấu trúc này rất thuận lợi cho việc thiết kế tăng tốc phần cứng vì có ranh giới rõ ràng giữa các khối xử lý và có thể tổ chức pipeline theo từng giai đoạn.</w:t>
+      </w:r>
+    </w:p>
+    <w:p>
+      <w:pPr>
+        <w:jc w:val="both"/>
+        <w:rPr>
+          <w:rFonts w:ascii="Arial" w:hAnsi="Arial" w:cs="Arial"/>
+          <w:sz w:val="26"/>
+          <w:szCs w:val="26"/>
+        </w:rPr>
+      </w:pPr>
+    </w:p>
+    <w:p>
+      <w:pPr>
+        <w:jc w:val="both"/>
+        <w:rPr>
+          <w:rFonts w:ascii="Arial" w:hAnsi="Arial" w:cs="Arial"/>
+          <w:sz w:val="26"/>
+          <w:szCs w:val="26"/>
+        </w:rPr>
+      </w:pPr>
       <w:r>
         <w:rPr>
           <w:rFonts w:ascii="Arial" w:hAnsi="Arial" w:cs="Arial"/>
@@ -2049,37 +2116,12 @@
           <w:szCs w:val="26"/>
         </w:rPr>
         <w:lastRenderedPageBreak/>
-        <w:t>EMNIST. Đặc biệt, cấu trúc này rất thuận lợi cho việc thiết kế tăng tốc phần cứng vì có ranh giới rõ ràng giữa các khối xử lý và có thể tổ chức pipeline theo từng giai đoạn.</w:t>
-      </w:r>
-    </w:p>
-    <w:p>
-      <w:pPr>
-        <w:rPr>
-          <w:rFonts w:ascii="Arial" w:hAnsi="Arial" w:cs="Arial"/>
-          <w:sz w:val="26"/>
-          <w:szCs w:val="26"/>
-        </w:rPr>
-      </w:pPr>
-      <w:r>
-        <w:rPr>
-          <w:rFonts w:ascii="Arial" w:hAnsi="Arial" w:cs="Arial"/>
-          <w:sz w:val="26"/>
-          <w:szCs w:val="26"/>
-        </w:rPr>
-        <w:t>[Hình cần bổ sung tại đây]</w:t>
-      </w:r>
-      <w:r>
-        <w:rPr>
-          <w:rFonts w:ascii="Arial" w:hAnsi="Arial" w:cs="Arial"/>
-          <w:sz w:val="26"/>
-          <w:szCs w:val="26"/>
-        </w:rPr>
-        <w:br/>
-        <w:t>Hình CNN bạn đã gửi ở đầu cuộc trao đổi rất phù hợp để đặt ở mục này nếu bạn muốn trình bày kiến trúc chi tiết hơn. Nếu đã đặt ở mục 1.2.1 thì ở đây chỉ cần dẫn lại hình hoặc không cần lặp.</w:t>
-      </w:r>
-    </w:p>
-    <w:p>
-      <w:pPr>
+        <w:t>1.3.2. Biến đổi kích thước tensor qua từng tầng</w:t>
+      </w:r>
+    </w:p>
+    <w:p>
+      <w:pPr>
+        <w:ind w:firstLine="720"/>
         <w:jc w:val="both"/>
         <w:rPr>
           <w:rFonts w:ascii="Arial" w:hAnsi="Arial" w:cs="Arial"/>
@@ -2093,11 +2135,12 @@
           <w:sz w:val="26"/>
           <w:szCs w:val="26"/>
         </w:rPr>
-        <w:t>1.3.2. Biến đổi kích thước tensor qua từng tầng</w:t>
-      </w:r>
-    </w:p>
-    <w:p>
-      <w:pPr>
+        <w:t>Khi đi qua từng tầng của mạng, dữ liệu không chỉ thay đổi về mặt giá trị mà còn thay đổi về hình dạng tensor. Ảnh đầu vào 28×28 sau khi đi qua lớp convolution đầu tiên sẽ sinh ra feature map với số kênh và kích thước không gian phụ thuộc vào kernel, stride và padding. Sau pooling, kích thước không gian tiếp tục giảm, làm cho dữ liệu cô đọng hơn. Quá trình này tiếp tục lặp lại ở tầng convolution thứ hai và pooling thứ hai, trước khi tensor được flatten thành vector 1 chiều để đưa vào các lớp fully connected.</w:t>
+      </w:r>
+    </w:p>
+    <w:p>
+      <w:pPr>
+        <w:ind w:firstLine="720"/>
         <w:jc w:val="both"/>
         <w:rPr>
           <w:rFonts w:ascii="Arial" w:hAnsi="Arial" w:cs="Arial"/>
@@ -2111,11 +2154,12 @@
           <w:sz w:val="26"/>
           <w:szCs w:val="26"/>
         </w:rPr>
-        <w:t>Khi đi qua từng tầng của mạng, dữ liệu không chỉ thay đổi về mặt giá trị mà còn thay đổi về hình dạng tensor. Ảnh đầu vào 28×28 sau khi đi qua lớp convolution đầu tiên sẽ sinh ra feature map với số kênh và kích thước không gian phụ thuộc vào kernel, stride và padding. Sau pooling, kích thước không gian tiếp tục giảm, làm cho dữ liệu cô đọng hơn. Quá trình này tiếp tục lặp lại ở tầng convolution thứ hai và pooling thứ hai, trước khi tensor được flatten thành vector 1 chiều để đưa vào các lớp fully connected.</w:t>
-      </w:r>
-    </w:p>
-    <w:p>
-      <w:pPr>
+        <w:t>Việc mô tả rõ kích thước tensor ở từng tầng là rất cần thiết vì nó quyết định: cách tổ chức bộ nhớ đệm, độ rộng bus dữ liệu, số lượng phần tử xử lý song song, và logic ánh xạ dữ liệu trong phần cứng.</w:t>
+      </w:r>
+    </w:p>
+    <w:p>
+      <w:pPr>
+        <w:ind w:firstLine="720"/>
         <w:jc w:val="both"/>
         <w:rPr>
           <w:rFonts w:ascii="Arial" w:hAnsi="Arial" w:cs="Arial"/>
@@ -2129,7 +2173,7 @@
           <w:sz w:val="26"/>
           <w:szCs w:val="26"/>
         </w:rPr>
-        <w:t>Việc mô tả rõ kích thước tensor ở từng tầng là rất cần thiết vì nó quyết định: cách tổ chức bộ nhớ đệm, độ rộng bus dữ liệu, số lượng phần tử xử lý song song, và logic ánh xạ dữ liệu trong phần cứng.</w:t>
+        <w:t>Trong triển khai phần cứng, chỉ cần sai khác một kích thước trung gian hoặc một quy ước sắp xếp tensor, toàn bộ pipeline sẽ cho kết quả sai. Do đó, phân tích hình học dữ liệu qua từng tầng không chỉ mang tính lý thuyết mà còn là cơ sở trực tiếp cho thiết kế phần cứng.</w:t>
       </w:r>
     </w:p>
     <w:p>
@@ -2147,29 +2191,12 @@
           <w:sz w:val="26"/>
           <w:szCs w:val="26"/>
         </w:rPr>
-        <w:t>Trong triển khai phần cứng, chỉ cần sai khác một kích thước trung gian hoặc một quy ước sắp xếp tensor, toàn bộ pipeline sẽ cho kết quả sai. Do đó, phân tích hình học dữ liệu qua từng tầng không chỉ mang tính lý thuyết mà còn là cơ sở trực tiếp cho thiết kế phần cứng.</w:t>
-      </w:r>
-    </w:p>
-    <w:p>
-      <w:pPr>
-        <w:jc w:val="both"/>
-        <w:rPr>
-          <w:rFonts w:ascii="Arial" w:hAnsi="Arial" w:cs="Arial"/>
-          <w:sz w:val="26"/>
-          <w:szCs w:val="26"/>
-        </w:rPr>
-      </w:pPr>
-      <w:r>
-        <w:rPr>
-          <w:rFonts w:ascii="Arial" w:hAnsi="Arial" w:cs="Arial"/>
-          <w:sz w:val="26"/>
-          <w:szCs w:val="26"/>
-        </w:rPr>
         <w:t>1.3.3. Thống kê tham số và yêu cầu bộ nhớ</w:t>
       </w:r>
     </w:p>
     <w:p>
       <w:pPr>
+        <w:ind w:firstLine="720"/>
         <w:jc w:val="both"/>
         <w:rPr>
           <w:rFonts w:ascii="Arial" w:hAnsi="Arial" w:cs="Arial"/>
@@ -2294,6 +2321,7 @@
     </w:p>
     <w:p>
       <w:pPr>
+        <w:ind w:firstLine="360"/>
         <w:jc w:val="both"/>
         <w:rPr>
           <w:rFonts w:ascii="Arial" w:hAnsi="Arial" w:cs="Arial"/>
@@ -2307,7 +2335,6 @@
           <w:sz w:val="26"/>
           <w:szCs w:val="26"/>
         </w:rPr>
-        <w:lastRenderedPageBreak/>
         <w:t>Nếu mô hình được biểu diễn ở dạng FP32, dung lượng bộ nhớ sẽ rất lớn và không phù hợp với triển khai phần cứng giới hạn tài nguyên. Khi chuyển sang INT8, dung lượng này giảm đáng kể, thường chỉ còn một phần tư so với FP32, từ đó tạo điều kiện cho việc lưu trữ nhiều trọng số hơn trong bộ nhớ on-chip hoặc giảm áp lực truy cập DDR.</w:t>
       </w:r>
     </w:p>
@@ -2360,6 +2387,7 @@
                 <w:sz w:val="26"/>
                 <w:szCs w:val="26"/>
               </w:rPr>
+              <w:lastRenderedPageBreak/>
               <w:t>Tầng</w:t>
             </w:r>
           </w:p>
@@ -4277,7 +4305,6 @@
                 <w:sz w:val="26"/>
                 <w:szCs w:val="26"/>
               </w:rPr>
-              <w:lastRenderedPageBreak/>
               <w:t>Argmax</w:t>
             </w:r>
           </w:p>
@@ -4464,6 +4491,7 @@
     </w:p>
     <w:p>
       <w:pPr>
+        <w:ind w:firstLine="720"/>
         <w:jc w:val="both"/>
         <w:rPr>
           <w:rFonts w:ascii="Arial" w:hAnsi="Arial" w:cs="Arial"/>
@@ -4477,11 +4505,21 @@
           <w:sz w:val="26"/>
           <w:szCs w:val="26"/>
         </w:rPr>
-        <w:t>Ngoài dung lượng bộ nhớ, số phép toán cũng là chỉ tiêu quan trọng để đánh giá mức độ phù hợp của mô hình với phần cứng. Trong CNN, tầng convolution thường chiếm phần lớn số phép MAC, đặc biệt khi kích thước feature map đầu vào còn lớn. Trong khi đó, các tầng fully connected tuy có cấu trúc đơn giản hơn nhưng cũng có thể tiêu tốn đáng kể số phép nhân cộng nếu số neuron lớn.</w:t>
-      </w:r>
-    </w:p>
-    <w:p>
-      <w:pPr>
+        <w:t xml:space="preserve">Ngoài dung lượng bộ nhớ, số phép toán cũng là chỉ tiêu quan trọng để đánh giá mức độ phù hợp của mô hình với phần cứng. Trong CNN, tầng convolution </w:t>
+      </w:r>
+      <w:r>
+        <w:rPr>
+          <w:rFonts w:ascii="Arial" w:hAnsi="Arial" w:cs="Arial"/>
+          <w:sz w:val="26"/>
+          <w:szCs w:val="26"/>
+        </w:rPr>
+        <w:lastRenderedPageBreak/>
+        <w:t>thường chiếm phần lớn số phép MAC, đặc biệt khi kích thước feature map đầu vào còn lớn. Trong khi đó, các tầng fully connected tuy có cấu trúc đơn giản hơn nhưng cũng có thể tiêu tốn đáng kể số phép nhân cộng nếu số neuron lớn.</w:t>
+      </w:r>
+    </w:p>
+    <w:p>
+      <w:pPr>
+        <w:ind w:firstLine="720"/>
         <w:jc w:val="both"/>
         <w:rPr>
           <w:rFonts w:ascii="Arial" w:hAnsi="Arial" w:cs="Arial"/>
@@ -4500,6 +4538,7 @@
     </w:p>
     <w:p>
       <w:pPr>
+        <w:ind w:firstLine="720"/>
         <w:jc w:val="both"/>
         <w:rPr>
           <w:rFonts w:ascii="Arial" w:hAnsi="Arial" w:cs="Arial"/>
@@ -4563,46 +4602,57 @@
     <w:p>
       <w:pPr>
         <w:spacing w:line="278" w:lineRule="auto"/>
-        <w:rPr>
-          <w:rFonts w:ascii="Arial" w:hAnsi="Arial" w:cs="Arial"/>
-          <w:sz w:val="26"/>
-          <w:szCs w:val="26"/>
-        </w:rPr>
-      </w:pPr>
-      <w:r>
-        <w:rPr>
-          <w:rFonts w:ascii="Arial" w:hAnsi="Arial" w:cs="Arial"/>
-          <w:sz w:val="26"/>
-          <w:szCs w:val="26"/>
-        </w:rPr>
-        <w:t>Trong các mô hình học sâu truyền thống, phép tính thường được biểu diễn bằng số thực dấu phẩy động 32 bit (FP32) để bảo đảm độ chính xác cao trong quá trình huấn luyện và suy luận. Tuy nhiên, FP32 đòi hỏi phần cứng nhân chia phức tạp, tiêu tốn nhiều tài nguyên logic và DSP, đồng thời làm tăng dung lượng lưu trữ và băng thông bộ nhớ. Khi triển khai trên FPGA, những yêu cầu này trở thành hạn chế đáng kể do tài nguyên on-chip có giới hạn.</w:t>
+        <w:ind w:firstLine="720"/>
+        <w:rPr>
+          <w:rFonts w:ascii="Arial" w:hAnsi="Arial" w:cs="Arial"/>
+          <w:sz w:val="26"/>
+          <w:szCs w:val="26"/>
+        </w:rPr>
+      </w:pPr>
+      <w:r>
+        <w:rPr>
+          <w:rFonts w:ascii="Arial" w:hAnsi="Arial" w:cs="Arial"/>
+          <w:sz w:val="26"/>
+          <w:szCs w:val="26"/>
+        </w:rPr>
+        <w:t xml:space="preserve">Trong các mô hình học sâu truyền thống, phép tính thường được biểu diễn bằng số thực dấu phẩy động </w:t>
+      </w:r>
+      <w:proofErr w:type="gramStart"/>
+      <w:r>
+        <w:rPr>
+          <w:rFonts w:ascii="Arial" w:hAnsi="Arial" w:cs="Arial"/>
+          <w:sz w:val="26"/>
+          <w:szCs w:val="26"/>
+        </w:rPr>
+        <w:t>32 bit</w:t>
+      </w:r>
+      <w:proofErr w:type="gramEnd"/>
+      <w:r>
+        <w:rPr>
+          <w:rFonts w:ascii="Arial" w:hAnsi="Arial" w:cs="Arial"/>
+          <w:sz w:val="26"/>
+          <w:szCs w:val="26"/>
+        </w:rPr>
+        <w:t xml:space="preserve"> (FP32) để bảo đảm độ chính xác cao trong quá trình huấn luyện và suy luận. Tuy nhiên, FP32 đòi hỏi phần cứng nhân chia phức tạp, tiêu tốn nhiều tài nguyên logic và DSP, đồng thời làm tăng dung lượng lưu trữ và băng thông bộ nhớ. Khi triển khai trên FPGA, những yêu cầu này trở thành hạn chế đáng kể do tài nguyên on-chip có giới hạn.</w:t>
       </w:r>
     </w:p>
     <w:p>
       <w:pPr>
         <w:spacing w:line="278" w:lineRule="auto"/>
-        <w:rPr>
-          <w:rFonts w:ascii="Arial" w:hAnsi="Arial" w:cs="Arial"/>
-          <w:sz w:val="26"/>
-          <w:szCs w:val="26"/>
-        </w:rPr>
-      </w:pPr>
-      <w:r>
-        <w:rPr>
-          <w:rFonts w:ascii="Arial" w:hAnsi="Arial" w:cs="Arial"/>
-          <w:sz w:val="26"/>
-          <w:szCs w:val="26"/>
-        </w:rPr>
-        <w:t xml:space="preserve">Việc chuyển sang signed INT8 là hướng tiếp cận phổ biến trong suy luận trên phần cứng vì giúp giảm chi phí tính toán, giảm kích thước bộ nhớ và tăng mức độ song song hóa. Nếu được lượng tử hóa hợp lý, mô hình vẫn có thể duy trì độ chính xác chấp nhận được trong khi hiệu năng và hiệu quả tài nguyên được cải thiện rõ rệt. Vì vậy, lượng tử hóa INT8 không chỉ là tối ưu phần cứng mà còn là </w:t>
-      </w:r>
-      <w:r>
-        <w:rPr>
-          <w:rFonts w:ascii="Arial" w:hAnsi="Arial" w:cs="Arial"/>
-          <w:sz w:val="26"/>
-          <w:szCs w:val="26"/>
-        </w:rPr>
-        <w:lastRenderedPageBreak/>
-        <w:t>bước cần thiết để CNN có thể triển khai hiệu quả trên FPGA và các hệ thống nhúng.</w:t>
+        <w:ind w:firstLine="720"/>
+        <w:rPr>
+          <w:rFonts w:ascii="Arial" w:hAnsi="Arial" w:cs="Arial"/>
+          <w:sz w:val="26"/>
+          <w:szCs w:val="26"/>
+        </w:rPr>
+      </w:pPr>
+      <w:r>
+        <w:rPr>
+          <w:rFonts w:ascii="Arial" w:hAnsi="Arial" w:cs="Arial"/>
+          <w:sz w:val="26"/>
+          <w:szCs w:val="26"/>
+        </w:rPr>
+        <w:t>Việc chuyển sang signed INT8 là hướng tiếp cận phổ biến trong suy luận trên phần cứng vì giúp giảm chi phí tính toán, giảm kích thước bộ nhớ và tăng mức độ song song hóa. Nếu được lượng tử hóa hợp lý, mô hình vẫn có thể duy trì độ chính xác chấp nhận được trong khi hiệu năng và hiệu quả tài nguyên được cải thiện rõ rệt. Vì vậy, lượng tử hóa INT8 không chỉ là tối ưu phần cứng mà còn là bước cần thiết để CNN có thể triển khai hiệu quả trên FPGA và các hệ thống nhúng.</w:t>
       </w:r>
     </w:p>
     <w:p>
@@ -4630,24 +4680,35 @@
     <w:p>
       <w:pPr>
         <w:spacing w:line="278" w:lineRule="auto"/>
-        <w:rPr>
-          <w:rFonts w:ascii="Arial" w:hAnsi="Arial" w:cs="Arial"/>
-          <w:sz w:val="26"/>
-          <w:szCs w:val="26"/>
-        </w:rPr>
-      </w:pPr>
-      <w:r>
-        <w:rPr>
-          <w:rFonts w:ascii="Arial" w:hAnsi="Arial" w:cs="Arial"/>
-          <w:sz w:val="26"/>
-          <w:szCs w:val="26"/>
-        </w:rPr>
-        <w:t>Trong lượng tử hóa đối xứng, miền giá trị số thực được ánh xạ sang miền số nguyên INT8 sao cho giá trị dương và âm có biên độ đối xứng quanh 0. Cách làm này giúp đơn giản hóa hiện thực phần cứng vì không cần xử lý zero-point như ở lượng tử hóa bất đối xứng. Với signed INT8, miền biểu diễn thường nằm trong khoảng từ -128 đến 127.</w:t>
+        <w:ind w:firstLine="720"/>
+        <w:rPr>
+          <w:rFonts w:ascii="Arial" w:hAnsi="Arial" w:cs="Arial"/>
+          <w:sz w:val="26"/>
+          <w:szCs w:val="26"/>
+        </w:rPr>
+      </w:pPr>
+      <w:r>
+        <w:rPr>
+          <w:rFonts w:ascii="Arial" w:hAnsi="Arial" w:cs="Arial"/>
+          <w:sz w:val="26"/>
+          <w:szCs w:val="26"/>
+        </w:rPr>
+        <w:t xml:space="preserve">Trong lượng tử hóa đối xứng, miền giá trị số thực được ánh xạ sang miền số nguyên INT8 sao cho giá trị dương và âm có biên độ đối xứng quanh 0. Cách làm này giúp đơn giản hóa hiện thực phần cứng vì không cần xử lý zero-point </w:t>
+      </w:r>
+      <w:r>
+        <w:rPr>
+          <w:rFonts w:ascii="Arial" w:hAnsi="Arial" w:cs="Arial"/>
+          <w:sz w:val="26"/>
+          <w:szCs w:val="26"/>
+        </w:rPr>
+        <w:lastRenderedPageBreak/>
+        <w:t>như ở lượng tử hóa bất đối xứng. Với signed INT8, miền biểu diễn thường nằm trong khoảng từ -128 đến 127.</w:t>
       </w:r>
     </w:p>
     <w:p>
       <w:pPr>
         <w:spacing w:line="278" w:lineRule="auto"/>
+        <w:ind w:firstLine="720"/>
         <w:rPr>
           <w:rFonts w:ascii="Arial" w:hAnsi="Arial" w:cs="Arial"/>
           <w:sz w:val="26"/>
@@ -4688,6 +4749,7 @@
     <w:p>
       <w:pPr>
         <w:spacing w:line="278" w:lineRule="auto"/>
+        <w:ind w:firstLine="720"/>
         <w:rPr>
           <w:rFonts w:ascii="Arial" w:hAnsi="Arial" w:cs="Arial"/>
           <w:sz w:val="26"/>
@@ -4706,6 +4768,7 @@
     <w:p>
       <w:pPr>
         <w:spacing w:line="278" w:lineRule="auto"/>
+        <w:ind w:firstLine="720"/>
         <w:rPr>
           <w:rFonts w:ascii="Arial" w:hAnsi="Arial" w:cs="Arial"/>
           <w:sz w:val="26"/>
@@ -4746,6 +4809,7 @@
     <w:p>
       <w:pPr>
         <w:spacing w:line="278" w:lineRule="auto"/>
+        <w:ind w:firstLine="720"/>
         <w:rPr>
           <w:rFonts w:ascii="Arial" w:hAnsi="Arial" w:cs="Arial"/>
           <w:sz w:val="26"/>
@@ -4764,6 +4828,7 @@
     <w:p>
       <w:pPr>
         <w:spacing w:line="278" w:lineRule="auto"/>
+        <w:ind w:firstLine="720"/>
         <w:rPr>
           <w:rFonts w:ascii="Arial" w:hAnsi="Arial" w:cs="Arial"/>
           <w:sz w:val="26"/>
@@ -4794,16 +4859,7 @@
           <w:sz w:val="26"/>
           <w:szCs w:val="26"/>
         </w:rPr>
-        <w:t xml:space="preserve">. Một cách hiện thực </w:t>
-      </w:r>
-      <w:r>
-        <w:rPr>
-          <w:rFonts w:ascii="Arial" w:hAnsi="Arial" w:cs="Arial"/>
-          <w:sz w:val="26"/>
-          <w:szCs w:val="26"/>
-        </w:rPr>
-        <w:lastRenderedPageBreak/>
-        <w:t>phổ biến là dùng cơ chế </w:t>
+        <w:t>. Một cách hiện thực phổ biến là dùng cơ chế </w:t>
       </w:r>
       <w:r>
         <w:rPr>
@@ -4827,19 +4883,29 @@
     <w:p>
       <w:pPr>
         <w:spacing w:line="278" w:lineRule="auto"/>
-        <w:rPr>
-          <w:rFonts w:ascii="Arial" w:hAnsi="Arial" w:cs="Arial"/>
-          <w:sz w:val="26"/>
-          <w:szCs w:val="26"/>
-        </w:rPr>
-      </w:pPr>
-      <w:r>
-        <w:rPr>
-          <w:rFonts w:ascii="Arial" w:hAnsi="Arial" w:cs="Arial"/>
-          <w:sz w:val="26"/>
-          <w:szCs w:val="26"/>
-        </w:rPr>
-        <w:t>Trong bước chuyển đổi này, hệ thống thường phải thực hiện làm tròn và bão hòa để giới hạn kết quả trong miền INT8. Mặc dù lượng tử hóa và requantization luôn tạo ra sai số nhất định, nhưng nếu được thiết kế hợp lý, mức suy giảm độ chính xác vẫn có thể chấp nhận được so với lợi ích lớn về hiệu năng và tài nguyên.</w:t>
+        <w:ind w:firstLine="720"/>
+        <w:rPr>
+          <w:rFonts w:ascii="Arial" w:hAnsi="Arial" w:cs="Arial"/>
+          <w:sz w:val="26"/>
+          <w:szCs w:val="26"/>
+        </w:rPr>
+      </w:pPr>
+      <w:r>
+        <w:rPr>
+          <w:rFonts w:ascii="Arial" w:hAnsi="Arial" w:cs="Arial"/>
+          <w:sz w:val="26"/>
+          <w:szCs w:val="26"/>
+        </w:rPr>
+        <w:t xml:space="preserve">Trong bước chuyển đổi này, hệ thống thường phải thực hiện làm tròn và bão hòa để giới hạn kết quả trong miền INT8. Mặc dù lượng tử hóa và </w:t>
+      </w:r>
+      <w:r>
+        <w:rPr>
+          <w:rFonts w:ascii="Arial" w:hAnsi="Arial" w:cs="Arial"/>
+          <w:sz w:val="26"/>
+          <w:szCs w:val="26"/>
+        </w:rPr>
+        <w:lastRenderedPageBreak/>
+        <w:t>requantization luôn tạo ra sai số nhất định, nhưng nếu được thiết kế hợp lý, mức suy giảm độ chính xác vẫn có thể chấp nhận được so với lợi ích lớn về hiệu năng và tài nguyên.</w:t>
       </w:r>
     </w:p>
     <w:p>
@@ -4858,7 +4924,7 @@
           <w:szCs w:val="26"/>
         </w:rPr>
         <w:pict w14:anchorId="59E73EC7">
-          <v:rect id="_x0000_i1032" style="width:0;height:3pt" o:hralign="center" o:hrstd="t" o:hr="t" fillcolor="#a0a0a0" stroked="f"/>
+          <v:rect id="_x0000_i1026" style="width:0;height:3pt" o:hralign="center" o:hrstd="t" o:hr="t" fillcolor="#a0a0a0" stroked="f"/>
         </w:pict>
       </w:r>
     </w:p>
@@ -5005,16 +5071,7 @@
           <w:sz w:val="26"/>
           <w:szCs w:val="26"/>
         </w:rPr>
-        <w:t xml:space="preserve">Giao tiếp giữa host và accelerator thường dựa trên chuẩn AXI. AXI4-Lite phù hợp cho các thanh ghi điều khiển và trạng thái; AXI4 Memory-Mapped dùng </w:t>
-      </w:r>
-      <w:r>
-        <w:rPr>
-          <w:rFonts w:ascii="Arial" w:hAnsi="Arial" w:cs="Arial"/>
-          <w:sz w:val="26"/>
-          <w:szCs w:val="26"/>
-        </w:rPr>
-        <w:lastRenderedPageBreak/>
-        <w:t>cho truy cập dữ liệu lớn; còn AXI4-Stream dùng cho truyền dữ liệu theo luồng với băng thông cao. DMA giữ vai trò trung gian quan trọng, cho phép truyền dữ liệu trực tiếp giữa DDR và accelerator mà không cần CPU xử lý từng phần tử dữ liệu. Điều này giúp giảm độ trễ và tăng hiệu quả khai thác phần cứng.</w:t>
+        <w:t>Giao tiếp giữa host và accelerator thường dựa trên chuẩn AXI. AXI4-Lite phù hợp cho các thanh ghi điều khiển và trạng thái; AXI4 Memory-Mapped dùng cho truy cập dữ liệu lớn; còn AXI4-Stream dùng cho truyền dữ liệu theo luồng với băng thông cao. DMA giữ vai trò trung gian quan trọng, cho phép truyền dữ liệu trực tiếp giữa DDR và accelerator mà không cần CPU xử lý từng phần tử dữ liệu. Điều này giúp giảm độ trễ và tăng hiệu quả khai thác phần cứng.</w:t>
       </w:r>
     </w:p>
     <w:p>
@@ -5042,6 +5099,7 @@
     <w:p>
       <w:pPr>
         <w:spacing w:line="278" w:lineRule="auto"/>
+        <w:ind w:firstLine="720"/>
         <w:jc w:val="both"/>
         <w:rPr>
           <w:rFonts w:ascii="Arial" w:hAnsi="Arial" w:cs="Arial"/>
@@ -5055,12 +5113,14 @@
           <w:sz w:val="26"/>
           <w:szCs w:val="26"/>
         </w:rPr>
+        <w:lastRenderedPageBreak/>
         <w:t>Một đặc điểm quan trọng của bộ tăng tốc CNN trên FPGA là kiến trúc streaming dataflow, tức là dữ liệu được xử lý liên tục theo luồng ngay khi vừa được đưa vào pipeline. Thay vì chờ toàn bộ ảnh được nạp xong mới xử lý, hệ thống cho dữ liệu đi qua từng khối tính toán theo trình tự, nhờ đó giảm độ trễ và tăng khả năng chồng lấp giữa nạp dữ liệu và xử lý.</w:t>
       </w:r>
     </w:p>
     <w:p>
       <w:pPr>
         <w:spacing w:line="278" w:lineRule="auto"/>
+        <w:ind w:firstLine="720"/>
         <w:jc w:val="both"/>
         <w:rPr>
           <w:rFonts w:ascii="Arial" w:hAnsi="Arial" w:cs="Arial"/>
@@ -5102,6 +5162,7 @@
     <w:p>
       <w:pPr>
         <w:spacing w:line="278" w:lineRule="auto"/>
+        <w:ind w:firstLine="720"/>
         <w:jc w:val="both"/>
         <w:rPr>
           <w:rFonts w:ascii="Arial" w:hAnsi="Arial" w:cs="Arial"/>
@@ -5121,6 +5182,7 @@
     <w:p>
       <w:pPr>
         <w:spacing w:line="278" w:lineRule="auto"/>
+        <w:ind w:firstLine="720"/>
         <w:jc w:val="both"/>
         <w:rPr>
           <w:rFonts w:ascii="Arial" w:hAnsi="Arial" w:cs="Arial"/>
@@ -11727,6 +11789,7 @@
   <w:style w:type="character" w:default="1" w:styleId="DefaultParagraphFont">
     <w:name w:val="Default Paragraph Font"/>
     <w:uiPriority w:val="1"/>
+    <w:semiHidden/>
     <w:unhideWhenUsed/>
   </w:style>
   <w:style w:type="table" w:default="1" w:styleId="TableNormal">

</xml_diff>